<commit_message>
Actualiza Subdocs 1, 4.2 y 5 con arquitectura consolidada
</commit_message>
<xml_diff>
--- a/subdoc5 datos/Subdoc5_ModeloGestionDatos_Overfore_v2.1.docx
+++ b/subdoc5 datos/Subdoc5_ModeloGestionDatos_Overfore_v2.1.docx
@@ -3290,7 +3290,7 @@
               <w:rPr>
                 <w:sz w:val="17"/>
               </w:rPr>
-              <w:t>C-23</w:t>
+              <w:t>C-04</w:t>
             </w:r>
           </w:p>
         </w:tc>
@@ -3308,7 +3308,7 @@
                 <w:b/>
                 <w:sz w:val="17"/>
               </w:rPr>
-              <w:t>Báscula de camiones</w:t>
+              <w:t>Báscula de camiones (dispositivo físico conectado al nodo Edge operacional C-04)</w:t>
             </w:r>
             <w:r>
               <w:rPr>

</xml_diff>